<commit_message>
feat: v7.1 — QA fixes, cover logos, LMS portal visual, LP/LG realignment
Deck bumped to v7.1: Tertiary Infotech logo on the cover, slide 71
rebuilt as an LMS-portal screenshot + step tiles, slide 27 callout
cleared of the lab banner, slide 69 footer standardised. slide_map.json
updated to the 75-slide layout; LP rebuilt with realigned slide ranges
and a 7.1 version row; LG cover gains the logo (7.1 row). v7.0 archived.

Co-Authored-By: Claude Fable 5 <noreply@anthropic.com>
</commit_message>
<xml_diff>
--- a/courseware/LP-Business Process Automation with Power Automate and Copilot Studio Agents.docx
+++ b/courseware/LP-Business Process Automation with Power Automate and Copilot Studio Agents.docx
@@ -4,6 +4,45 @@
   <w:body>
     <w:p/>
     <w:p/>
+    <w:p>
+      <w:pPr>
+        <w:jc w:val="center"/>
+      </w:pPr>
+      <w:r>
+        <w:drawing>
+          <wp:inline xmlns:a="http://schemas.openxmlformats.org/drawingml/2006/main" xmlns:pic="http://schemas.openxmlformats.org/drawingml/2006/picture">
+            <wp:extent cx="1005840" cy="1005840"/>
+            <wp:docPr id="1" name="Picture 1"/>
+            <wp:cNvGraphicFramePr>
+              <a:graphicFrameLocks noChangeAspect="1"/>
+            </wp:cNvGraphicFramePr>
+            <a:graphic>
+              <a:graphicData uri="http://schemas.openxmlformats.org/drawingml/2006/picture">
+                <pic:pic>
+                  <pic:nvPicPr>
+                    <pic:cNvPr id="0" name="tertiary-infotech-logo.png"/>
+                    <pic:cNvPicPr/>
+                  </pic:nvPicPr>
+                  <pic:blipFill>
+                    <a:blip r:embed="rId9"/>
+                    <a:stretch>
+                      <a:fillRect/>
+                    </a:stretch>
+                  </pic:blipFill>
+                  <pic:spPr>
+                    <a:xfrm>
+                      <a:off x="0" y="0"/>
+                      <a:ext cx="1005840" cy="1005840"/>
+                    </a:xfrm>
+                    <a:prstGeom prst="rect"/>
+                  </pic:spPr>
+                </pic:pic>
+              </a:graphicData>
+            </a:graphic>
+          </wp:inline>
+        </w:drawing>
+      </w:r>
+    </w:p>
     <w:p/>
     <w:p>
       <w:pPr>
@@ -167,7 +206,7 @@
           <w:color w:val="1F6FEB"/>
           <w:sz w:val="24"/>
         </w:rPr>
-        <w:t>Version 7.0</w:t>
+        <w:t>Version 7.1</w:t>
       </w:r>
     </w:p>
     <w:p>
@@ -967,6 +1006,64 @@
           </w:p>
         </w:tc>
       </w:tr>
+      <w:tr>
+        <w:tc>
+          <w:tcPr>
+            <w:tcW w:type="dxa" w:w="2160"/>
+          </w:tcPr>
+          <w:p>
+            <w:r/>
+            <w:r>
+              <w:rPr>
+                <w:sz w:val="19"/>
+              </w:rPr>
+              <w:t>7.1</w:t>
+            </w:r>
+          </w:p>
+        </w:tc>
+        <w:tc>
+          <w:tcPr>
+            <w:tcW w:type="dxa" w:w="2160"/>
+          </w:tcPr>
+          <w:p>
+            <w:r/>
+            <w:r>
+              <w:rPr>
+                <w:sz w:val="19"/>
+              </w:rPr>
+              <w:t>6 Aug 2026</w:t>
+            </w:r>
+          </w:p>
+        </w:tc>
+        <w:tc>
+          <w:tcPr>
+            <w:tcW w:type="dxa" w:w="2160"/>
+          </w:tcPr>
+          <w:p>
+            <w:r/>
+            <w:r>
+              <w:rPr>
+                <w:sz w:val="19"/>
+              </w:rPr>
+              <w:t>Slide references realigned to the expanded 75-slide v7.1 deck: new Copilot Studio content folded into Modules 3-4 (model and harness, choosing a harness, modern orchestration, the new agent and workflow designers, skills as instructions on demand) plus a training-accounts slide in the course overview.</w:t>
+            </w:r>
+          </w:p>
+        </w:tc>
+        <w:tc>
+          <w:tcPr>
+            <w:tcW w:type="dxa" w:w="2160"/>
+          </w:tcPr>
+          <w:p>
+            <w:r/>
+            <w:r>
+              <w:rPr>
+                <w:sz w:val="19"/>
+              </w:rPr>
+              <w:t>Course Development Team</w:t>
+            </w:r>
+          </w:p>
+        </w:tc>
+      </w:tr>
     </w:tbl>
     <w:p>
       <w:r>
@@ -1421,7 +1518,7 @@
     </w:p>
     <w:p>
       <w:r>
-        <w:t>The Slides column maps each session to the matching slides in the facilitator deck (Business Process Automation with Power Automate and Copilot Studio Agents-v7.0.pptx, 68 slides) so trainers can pace delivery against the deck.</w:t>
+        <w:t>The Slides column maps each session to the matching slides in the facilitator deck (Business Process Automation with Power Automate and Copilot Studio Agents-v7.1.pptx, 75 slides) so trainers can pace delivery against the deck.</w:t>
       </w:r>
     </w:p>
     <w:p>
@@ -1625,7 +1722,7 @@
               <w:rPr>
                 <w:sz w:val="19"/>
               </w:rPr>
-              <w:t>7–11</w:t>
+              <w:t>7–12</w:t>
             </w:r>
           </w:p>
         </w:tc>
@@ -1706,7 +1803,7 @@
               <w:rPr>
                 <w:sz w:val="19"/>
               </w:rPr>
-              <w:t>12–17</w:t>
+              <w:t>13–18</w:t>
             </w:r>
           </w:p>
         </w:tc>
@@ -1867,7 +1964,7 @@
               <w:rPr>
                 <w:sz w:val="19"/>
               </w:rPr>
-              <w:t>21</w:t>
+              <w:t>22</w:t>
             </w:r>
           </w:p>
         </w:tc>
@@ -1948,7 +2045,7 @@
               <w:rPr>
                 <w:sz w:val="19"/>
               </w:rPr>
-              <w:t>22</w:t>
+              <w:t>23</w:t>
             </w:r>
           </w:p>
         </w:tc>
@@ -2029,7 +2126,7 @@
               <w:rPr>
                 <w:sz w:val="19"/>
               </w:rPr>
-              <w:t>18–20</w:t>
+              <w:t>19–21</w:t>
             </w:r>
           </w:p>
         </w:tc>
@@ -2190,7 +2287,7 @@
               <w:rPr>
                 <w:sz w:val="19"/>
               </w:rPr>
-              <w:t>23</w:t>
+              <w:t>24</w:t>
             </w:r>
           </w:p>
         </w:tc>
@@ -2271,7 +2368,7 @@
               <w:rPr>
                 <w:sz w:val="19"/>
               </w:rPr>
-              <w:t>24–27</w:t>
+              <w:t>25–28</w:t>
             </w:r>
           </w:p>
         </w:tc>
@@ -2432,7 +2529,7 @@
               <w:rPr>
                 <w:sz w:val="19"/>
               </w:rPr>
-              <w:t>28</w:t>
+              <w:t>29</w:t>
             </w:r>
           </w:p>
         </w:tc>
@@ -2483,7 +2580,7 @@
                 <w:b/>
                 <w:sz w:val="19"/>
               </w:rPr>
-              <w:t>Module 3: workflow versus agent; agent anatomy — instructions, skills, knowledge, tools; what is actually enforced; connected agents; publishing</w:t>
+              <w:t>Module 3: workflow versus agent; the new Copilot Studio (model and harness, the new agent designer); agent anatomy — instructions, skills, knowledge, tools; what is actually enforced; connected agents; publishing</w:t>
             </w:r>
           </w:p>
         </w:tc>
@@ -2513,7 +2610,7 @@
               <w:rPr>
                 <w:sz w:val="19"/>
               </w:rPr>
-              <w:t>29–37</w:t>
+              <w:t>30–43</w:t>
             </w:r>
           </w:p>
         </w:tc>
@@ -2594,7 +2691,7 @@
               <w:rPr>
                 <w:sz w:val="19"/>
               </w:rPr>
-              <w:t>38</w:t>
+              <w:t>44</w:t>
             </w:r>
           </w:p>
         </w:tc>
@@ -2675,7 +2772,7 @@
               <w:rPr>
                 <w:sz w:val="19"/>
               </w:rPr>
-              <w:t>37</w:t>
+              <w:t>30–43</w:t>
             </w:r>
           </w:p>
         </w:tc>
@@ -2883,7 +2980,7 @@
               <w:rPr>
                 <w:sz w:val="19"/>
               </w:rPr>
-              <w:t>29–37</w:t>
+              <w:t>30–43</w:t>
             </w:r>
           </w:p>
         </w:tc>
@@ -2964,7 +3061,7 @@
               <w:rPr>
                 <w:sz w:val="19"/>
               </w:rPr>
-              <w:t>39</w:t>
+              <w:t>45</w:t>
             </w:r>
           </w:p>
         </w:tc>
@@ -3015,7 +3112,7 @@
                 <w:b/>
                 <w:sz w:val="19"/>
               </w:rPr>
-              <w:t>Module 4: agent flows and the Agent node, HTTP request and response, JSON schema, structured output, the boundary of agency</w:t>
+              <w:t>Module 4: agent flows and the Agent node, the new workflow designer, HTTP request and response, JSON schema, structured output, the boundary of agency</w:t>
             </w:r>
           </w:p>
         </w:tc>
@@ -3045,7 +3142,7 @@
               <w:rPr>
                 <w:sz w:val="19"/>
               </w:rPr>
-              <w:t>40–46</w:t>
+              <w:t>46–53</w:t>
             </w:r>
           </w:p>
         </w:tc>
@@ -3126,7 +3223,7 @@
               <w:rPr>
                 <w:sz w:val="19"/>
               </w:rPr>
-              <w:t>47</w:t>
+              <w:t>54</w:t>
             </w:r>
           </w:p>
         </w:tc>
@@ -3287,7 +3384,7 @@
               <w:rPr>
                 <w:sz w:val="19"/>
               </w:rPr>
-              <w:t>48</w:t>
+              <w:t>55</w:t>
             </w:r>
           </w:p>
         </w:tc>
@@ -3448,7 +3545,7 @@
               <w:rPr>
                 <w:sz w:val="19"/>
               </w:rPr>
-              <w:t>49</w:t>
+              <w:t>56</w:t>
             </w:r>
           </w:p>
         </w:tc>
@@ -3529,7 +3626,7 @@
               <w:rPr>
                 <w:sz w:val="19"/>
               </w:rPr>
-              <w:t>50–54</w:t>
+              <w:t>57–61</w:t>
             </w:r>
           </w:p>
         </w:tc>
@@ -3610,7 +3707,7 @@
               <w:rPr>
                 <w:sz w:val="19"/>
               </w:rPr>
-              <w:t>55</w:t>
+              <w:t>62</w:t>
             </w:r>
           </w:p>
         </w:tc>
@@ -3771,7 +3868,7 @@
               <w:rPr>
                 <w:sz w:val="19"/>
               </w:rPr>
-              <w:t>56</w:t>
+              <w:t>63</w:t>
             </w:r>
           </w:p>
         </w:tc>
@@ -3852,7 +3949,7 @@
               <w:rPr>
                 <w:sz w:val="19"/>
               </w:rPr>
-              <w:t>57–60</w:t>
+              <w:t>64–67</w:t>
             </w:r>
           </w:p>
         </w:tc>
@@ -3933,7 +4030,7 @@
               <w:rPr>
                 <w:sz w:val="19"/>
               </w:rPr>
-              <w:t>61–68</w:t>
+              <w:t>68–75</w:t>
             </w:r>
           </w:p>
         </w:tc>
@@ -4014,7 +4111,7 @@
               <w:rPr>
                 <w:sz w:val="19"/>
               </w:rPr>
-              <w:t>61–68</w:t>
+              <w:t>68–75</w:t>
             </w:r>
           </w:p>
         </w:tc>
@@ -4047,7 +4144,7 @@
         <w:pStyle w:val="Heading3"/>
       </w:pPr>
       <w:r>
-        <w:t>Lab 0 — Environment Setup · Slides 21</w:t>
+        <w:t>Lab 0 — Environment Setup · Slides 22</w:t>
       </w:r>
     </w:p>
     <w:p>
@@ -4060,7 +4157,7 @@
         <w:pStyle w:val="Heading3"/>
       </w:pPr>
       <w:r>
-        <w:t>Lab 1 — Trigger and Actions · Slides 22</w:t>
+        <w:t>Lab 1 — Trigger and Actions · Slides 23</w:t>
       </w:r>
     </w:p>
     <w:p>
@@ -4073,7 +4170,7 @@
         <w:pStyle w:val="Heading3"/>
       </w:pPr>
       <w:r>
-        <w:t>Lab 2 — Log to Excel · Slides 23</w:t>
+        <w:t>Lab 2 — Log to Excel · Slides 24</w:t>
       </w:r>
     </w:p>
     <w:p>
@@ -4086,7 +4183,7 @@
         <w:pStyle w:val="Heading3"/>
       </w:pPr>
       <w:r>
-        <w:t>Lab 3 — Leave Application Approval · Slides 28</w:t>
+        <w:t>Lab 3 — Leave Application Approval · Slides 29</w:t>
       </w:r>
     </w:p>
     <w:p>
@@ -4099,7 +4196,7 @@
         <w:pStyle w:val="Heading3"/>
       </w:pPr>
       <w:r>
-        <w:t>Lab 4 — Agents · Slides 38</w:t>
+        <w:t>Lab 4 — Agents · Slides 44</w:t>
       </w:r>
     </w:p>
     <w:p>
@@ -4120,7 +4217,7 @@
         <w:pStyle w:val="Heading3"/>
       </w:pPr>
       <w:r>
-        <w:t>Lab 5 — Invoke Agents · Slides 39</w:t>
+        <w:t>Lab 5 — Invoke Agents · Slides 45</w:t>
       </w:r>
     </w:p>
     <w:p>
@@ -4133,7 +4230,7 @@
         <w:pStyle w:val="Heading3"/>
       </w:pPr>
       <w:r>
-        <w:t>Lab 6 — HTTP and Application Approval Agent · Slides 47</w:t>
+        <w:t>Lab 6 — HTTP and Application Approval Agent · Slides 54</w:t>
       </w:r>
     </w:p>
     <w:p>
@@ -4146,7 +4243,7 @@
         <w:pStyle w:val="Heading3"/>
       </w:pPr>
       <w:r>
-        <w:t>Lab 7 — HTTP and Chatbot · Slides 48</w:t>
+        <w:t>Lab 7 — HTTP and Chatbot · Slides 55</w:t>
       </w:r>
     </w:p>
     <w:p>
@@ -4159,7 +4256,7 @@
         <w:pStyle w:val="Heading3"/>
       </w:pPr>
       <w:r>
-        <w:t>Lab 8 — HTTP and Human Review · Slides 49</w:t>
+        <w:t>Lab 8 — HTTP and Human Review · Slides 56</w:t>
       </w:r>
     </w:p>
     <w:p>
@@ -4172,7 +4269,7 @@
         <w:pStyle w:val="Heading3"/>
       </w:pPr>
       <w:r>
-        <w:t>Lab 9 — RAG with Knowledge Base · Slides 55</w:t>
+        <w:t>Lab 9 — RAG with Knowledge Base · Slides 62</w:t>
       </w:r>
     </w:p>
     <w:p>
@@ -4185,7 +4282,7 @@
         <w:pStyle w:val="Heading3"/>
       </w:pPr>
       <w:r>
-        <w:t>Lab 10 — RAG with Pinecone · Slides 56</w:t>
+        <w:t>Lab 10 — RAG with Pinecone · Slides 63</w:t>
       </w:r>
     </w:p>
     <w:p>
@@ -4504,7 +4601,7 @@
       </w:r>
     </w:p>
     <w:sectPr>
-      <w:footerReference w:type="default" r:id="rId9"/>
+      <w:footerReference w:type="default" r:id="rId10"/>
       <w:pgSz w:w="12240" w:h="15840"/>
       <w:pgMar w:top="1440" w:right="1800" w:bottom="1440" w:left="1800" w:header="720" w:footer="720" w:gutter="0"/>
       <w:cols w:space="720"/>

</xml_diff>

<commit_message>
feat: v7.3 — align PPT/LG/LP to the 13-lab structure (Labs 4b & 5b)
- Deck v7.3 (80 slides): new Agent Settings and Publishing an Agent — Channels
  concept slides (live-dialog recreations), Lab 4b Multi-Agent Content Team and
  Lab 5b Calling Workflow from Agent workflow slides, 13-lab journey, retimed
  schedule, Microsoft 365 personal-accounts slide
- Labs: Lab 5 renamed to Calling Agent from Workflow (old lab retired to
  labs-archive), new Lab 5b, Lab 4b folder renamed to Multi-Agent Content Team
  with a new workflow flowchart, detailed skill-package upload steps in Lab 4
- LG (150 pp) and LP regenerated from the single-source builders: full Lab 4b/5b
  activities, retimed Day 2 (Lab 6 50 min), version 7.3 records; builder fix for
  wrapped-line/sub-bullet rendering (em-dash corruption)
- alignment_manifest.json + slide_map.json as the v7.3 source of truth

Co-Authored-By: Claude Fable 5 <noreply@anthropic.com>
</commit_message>
<xml_diff>
--- a/courseware/LP-Business Process Automation with Power Automate and Copilot Studio Agents.docx
+++ b/courseware/LP-Business Process Automation with Power Automate and Copilot Studio Agents.docx
@@ -206,7 +206,7 @@
           <w:color w:val="1F6FEB"/>
           <w:sz w:val="24"/>
         </w:rPr>
-        <w:t>Version 7.1</w:t>
+        <w:t>Version 7.3</w:t>
       </w:r>
     </w:p>
     <w:p>
@@ -1064,6 +1064,122 @@
           </w:p>
         </w:tc>
       </w:tr>
+      <w:tr>
+        <w:tc>
+          <w:tcPr>
+            <w:tcW w:type="dxa" w:w="2160"/>
+          </w:tcPr>
+          <w:p>
+            <w:r/>
+            <w:r>
+              <w:rPr>
+                <w:sz w:val="19"/>
+              </w:rPr>
+              <w:t>7.2</w:t>
+            </w:r>
+          </w:p>
+        </w:tc>
+        <w:tc>
+          <w:tcPr>
+            <w:tcW w:type="dxa" w:w="2160"/>
+          </w:tcPr>
+          <w:p>
+            <w:r/>
+            <w:r>
+              <w:rPr>
+                <w:sz w:val="19"/>
+              </w:rPr>
+              <w:t>6 Aug 2026</w:t>
+            </w:r>
+          </w:p>
+        </w:tc>
+        <w:tc>
+          <w:tcPr>
+            <w:tcW w:type="dxa" w:w="2160"/>
+          </w:tcPr>
+          <w:p>
+            <w:r/>
+            <w:r>
+              <w:rPr>
+                <w:sz w:val="19"/>
+              </w:rPr>
+              <w:t>Lab 5 replaced — renamed from Invoke Agents to Calling Agent from Workflow: an agent flow that collects a blog topic at the Start node, drafts the post with M365 Copilot and posts it to the Training team's General channel. Day 2 session and deck references updated to the v7.2 deck.</w:t>
+            </w:r>
+          </w:p>
+        </w:tc>
+        <w:tc>
+          <w:tcPr>
+            <w:tcW w:type="dxa" w:w="2160"/>
+          </w:tcPr>
+          <w:p>
+            <w:r/>
+            <w:r>
+              <w:rPr>
+                <w:sz w:val="19"/>
+              </w:rPr>
+              <w:t>Course Development Team</w:t>
+            </w:r>
+          </w:p>
+        </w:tc>
+      </w:tr>
+      <w:tr>
+        <w:tc>
+          <w:tcPr>
+            <w:tcW w:type="dxa" w:w="2160"/>
+          </w:tcPr>
+          <w:p>
+            <w:r/>
+            <w:r>
+              <w:rPr>
+                <w:sz w:val="19"/>
+              </w:rPr>
+              <w:t>7.3</w:t>
+            </w:r>
+          </w:p>
+        </w:tc>
+        <w:tc>
+          <w:tcPr>
+            <w:tcW w:type="dxa" w:w="2160"/>
+          </w:tcPr>
+          <w:p>
+            <w:r/>
+            <w:r>
+              <w:rPr>
+                <w:sz w:val="19"/>
+              </w:rPr>
+              <w:t>6 Aug 2026</w:t>
+            </w:r>
+          </w:p>
+        </w:tc>
+        <w:tc>
+          <w:tcPr>
+            <w:tcW w:type="dxa" w:w="2160"/>
+          </w:tcPr>
+          <w:p>
+            <w:r/>
+            <w:r>
+              <w:rPr>
+                <w:sz w:val="19"/>
+              </w:rPr>
+              <w:t>Aligned to the 13-lab structure and the 80-slide v7.3 deck — Lab 4b (Multi-Agent Content Team) added as the optional Day 1 extension of Lab 4, Lab 5b (Calling Workflow from Agent) scheduled after Lab 5 on Day 2 (recap, Module 4, Lab 6 and Module 5 retimed to fit), and all slide mappings updated.</w:t>
+            </w:r>
+          </w:p>
+        </w:tc>
+        <w:tc>
+          <w:tcPr>
+            <w:tcW w:type="dxa" w:w="2160"/>
+          </w:tcPr>
+          <w:p>
+            <w:r/>
+            <w:r>
+              <w:rPr>
+                <w:sz w:val="19"/>
+              </w:rPr>
+              <w:t>Course Development Team</w:t>
+            </w:r>
+          </w:p>
+        </w:tc>
+      </w:tr>
     </w:tbl>
     <w:p>
       <w:r>
@@ -1401,7 +1517,7 @@
               <w:rPr>
                 <w:sz w:val="20"/>
               </w:rPr>
-              <w:t>11 step-by-step labs across 2 days (Lab 0 setup plus Labs 1–10: five on Day 1 and six on Day 2), driven by 5 concept modules</w:t>
+              <w:t>13 step-by-step labs across 2 days (Lab 0 setup plus Labs 1–10, plus the optional Lab 4b and Lab 5b: Labs 0–4b on Day 1, Labs 5–10 on Day 2), driven by 5 concept modules</w:t>
             </w:r>
           </w:p>
         </w:tc>
@@ -1518,7 +1634,7 @@
     </w:p>
     <w:p>
       <w:r>
-        <w:t>The Slides column maps each session to the matching slides in the facilitator deck (Business Process Automation with Power Automate and Copilot Studio Agents-v7.1.pptx, 75 slides) so trainers can pace delivery against the deck.</w:t>
+        <w:t>The Slides column maps each session to the matching slides in the facilitator deck (Business Process Automation with Power Automate and Copilot Studio Agents-v7.3.pptx, 80 slides) so trainers can pace delivery against the deck.</w:t>
       </w:r>
     </w:p>
     <w:p>
@@ -1531,7 +1647,7 @@
     </w:p>
     <w:p>
       <w:r>
-        <w:t>Modules 1–3: automation concepts, triggers and actions, control flow and human in the loop, then agent anatomy — Labs 0–4.</w:t>
+        <w:t>Modules 1–3: automation concepts, triggers and actions, control flow and human in the loop, then agent anatomy — Labs 0–4, with the optional Lab 4b.</w:t>
       </w:r>
     </w:p>
     <w:tbl>
@@ -1722,7 +1838,7 @@
               <w:rPr>
                 <w:sz w:val="19"/>
               </w:rPr>
-              <w:t>7–12</w:t>
+              <w:t>7–13</w:t>
             </w:r>
           </w:p>
         </w:tc>
@@ -1964,7 +2080,7 @@
               <w:rPr>
                 <w:sz w:val="19"/>
               </w:rPr>
-              <w:t>22</w:t>
+              <w:t>23</w:t>
             </w:r>
           </w:p>
         </w:tc>
@@ -2045,7 +2161,7 @@
               <w:rPr>
                 <w:sz w:val="19"/>
               </w:rPr>
-              <w:t>23</w:t>
+              <w:t>24</w:t>
             </w:r>
           </w:p>
         </w:tc>
@@ -2287,7 +2403,7 @@
               <w:rPr>
                 <w:sz w:val="19"/>
               </w:rPr>
-              <w:t>24</w:t>
+              <w:t>25</w:t>
             </w:r>
           </w:p>
         </w:tc>
@@ -2368,7 +2484,7 @@
               <w:rPr>
                 <w:sz w:val="19"/>
               </w:rPr>
-              <w:t>25–28</w:t>
+              <w:t>26–29</w:t>
             </w:r>
           </w:p>
         </w:tc>
@@ -2529,7 +2645,7 @@
               <w:rPr>
                 <w:sz w:val="19"/>
               </w:rPr>
-              <w:t>29</w:t>
+              <w:t>30</w:t>
             </w:r>
           </w:p>
         </w:tc>
@@ -2580,7 +2696,7 @@
                 <w:b/>
                 <w:sz w:val="19"/>
               </w:rPr>
-              <w:t>Module 3: workflow versus agent; the new Copilot Studio (model and harness, the new agent designer); agent anatomy — instructions, skills, knowledge, tools; what is actually enforced; connected agents; publishing</w:t>
+              <w:t>Module 3: workflow versus agent; the new Copilot Studio (model and harness, the new agent designer); agent anatomy — instructions, skills, knowledge, tools; what is actually enforced; connected agents; agent settings; publishing and channels</w:t>
             </w:r>
           </w:p>
         </w:tc>
@@ -2610,7 +2726,7 @@
               <w:rPr>
                 <w:sz w:val="19"/>
               </w:rPr>
-              <w:t>30–43</w:t>
+              <w:t>31–46</w:t>
             </w:r>
           </w:p>
         </w:tc>
@@ -2661,7 +2777,7 @@
                 <w:b/>
                 <w:sz w:val="19"/>
               </w:rPr>
-              <w:t>Lab 4 — Agents — assemble the Procurement, HR, Sales and IT Support agents</w:t>
+              <w:t>Lab 4 — Agents — assemble the Procurement, HR, Sales and IT Support agents (optional extension: Lab 4b — Multi-Agent Content Team, 60–75 min, self-paced)</w:t>
             </w:r>
           </w:p>
         </w:tc>
@@ -2691,7 +2807,7 @@
               <w:rPr>
                 <w:sz w:val="19"/>
               </w:rPr>
-              <w:t>44</w:t>
+              <w:t>47–48</w:t>
             </w:r>
           </w:p>
         </w:tc>
@@ -2772,7 +2888,7 @@
               <w:rPr>
                 <w:sz w:val="19"/>
               </w:rPr>
-              <w:t>30–43</w:t>
+              <w:t>31–46</w:t>
             </w:r>
           </w:p>
         </w:tc>
@@ -2789,7 +2905,7 @@
     </w:p>
     <w:p>
       <w:r>
-        <w:t>Modules 4–5: HTTP and the boundary of agency, the human review gate, and RAG twice over — Labs 5–10, then the assessment.</w:t>
+        <w:t>Modules 4–5: HTTP and the boundary of agency, the human review gate, and RAG twice over — Labs 5, 5b and 6–10, then the assessment.</w:t>
       </w:r>
     </w:p>
     <w:tbl>
@@ -2919,7 +3035,7 @@
               <w:rPr>
                 <w:sz w:val="19"/>
               </w:rPr>
-              <w:t>9:00 – 9:10</w:t>
+              <w:t>9:00 – 9:05</w:t>
             </w:r>
           </w:p>
         </w:tc>
@@ -2934,7 +3050,7 @@
               <w:rPr>
                 <w:sz w:val="19"/>
               </w:rPr>
-              <w:t>10 min</w:t>
+              <w:t>5 min</w:t>
             </w:r>
           </w:p>
         </w:tc>
@@ -2980,7 +3096,7 @@
               <w:rPr>
                 <w:sz w:val="19"/>
               </w:rPr>
-              <w:t>30–43</w:t>
+              <w:t>31–46</w:t>
             </w:r>
           </w:p>
         </w:tc>
@@ -3000,7 +3116,7 @@
               <w:rPr>
                 <w:sz w:val="19"/>
               </w:rPr>
-              <w:t>9:10 – 9:40</w:t>
+              <w:t>9:05 – 9:35</w:t>
             </w:r>
           </w:p>
         </w:tc>
@@ -3031,7 +3147,7 @@
                 <w:b/>
                 <w:sz w:val="19"/>
               </w:rPr>
-              <w:t>Lab 5 — Invoke Agents — ground the HR agent in SharePoint, test its refusals, publish to Teams</w:t>
+              <w:t>Lab 5 — Calling Agent from Workflow — Start-node topic input, M365 Copilot drafts the blog, posted to the Training team's General channel</w:t>
             </w:r>
           </w:p>
         </w:tc>
@@ -3061,7 +3177,88 @@
               <w:rPr>
                 <w:sz w:val="19"/>
               </w:rPr>
-              <w:t>45</w:t>
+              <w:t>49</w:t>
+            </w:r>
+          </w:p>
+        </w:tc>
+      </w:tr>
+      <w:tr>
+        <w:trPr>
+          <w:cantSplit/>
+        </w:trPr>
+        <w:tc>
+          <w:tcPr>
+            <w:tcW w:type="dxa" w:w="1520"/>
+            <w:shd w:val="clear" w:color="auto" w:fill="E8F7EE"/>
+          </w:tcPr>
+          <w:p>
+            <w:r/>
+            <w:r>
+              <w:rPr>
+                <w:sz w:val="19"/>
+              </w:rPr>
+              <w:t>9:35 – 10:05</w:t>
+            </w:r>
+          </w:p>
+        </w:tc>
+        <w:tc>
+          <w:tcPr>
+            <w:tcW w:type="dxa" w:w="1000"/>
+            <w:shd w:val="clear" w:color="auto" w:fill="E8F7EE"/>
+          </w:tcPr>
+          <w:p>
+            <w:r/>
+            <w:r>
+              <w:rPr>
+                <w:sz w:val="19"/>
+              </w:rPr>
+              <w:t>30 min</w:t>
+            </w:r>
+          </w:p>
+        </w:tc>
+        <w:tc>
+          <w:tcPr>
+            <w:tcW w:type="dxa" w:w="1728"/>
+            <w:shd w:val="clear" w:color="auto" w:fill="E8F7EE"/>
+          </w:tcPr>
+          <w:p>
+            <w:r/>
+            <w:r>
+              <w:rPr>
+                <w:b/>
+                <w:sz w:val="19"/>
+              </w:rPr>
+              <w:t>Lab 5b — Calling Workflow from Agent — the same boundary crossed the other way: the Blog Writer Agent runs the published flow as its tool</w:t>
+            </w:r>
+          </w:p>
+        </w:tc>
+        <w:tc>
+          <w:tcPr>
+            <w:tcW w:type="dxa" w:w="1760"/>
+            <w:shd w:val="clear" w:color="auto" w:fill="E8F7EE"/>
+          </w:tcPr>
+          <w:p>
+            <w:r/>
+            <w:r>
+              <w:rPr>
+                <w:sz w:val="19"/>
+              </w:rPr>
+              <w:t>Hands-on lab</w:t>
+            </w:r>
+          </w:p>
+        </w:tc>
+        <w:tc>
+          <w:tcPr>
+            <w:tcW w:type="dxa" w:w="1120"/>
+            <w:shd w:val="clear" w:color="auto" w:fill="E8F7EE"/>
+          </w:tcPr>
+          <w:p>
+            <w:r/>
+            <w:r>
+              <w:rPr>
+                <w:sz w:val="19"/>
+              </w:rPr>
+              <w:t>50</w:t>
             </w:r>
           </w:p>
         </w:tc>
@@ -3081,7 +3278,7 @@
               <w:rPr>
                 <w:sz w:val="19"/>
               </w:rPr>
-              <w:t>9:40 – 10:10</w:t>
+              <w:t>10:05 – 10:25</w:t>
             </w:r>
           </w:p>
         </w:tc>
@@ -3096,7 +3293,7 @@
               <w:rPr>
                 <w:sz w:val="19"/>
               </w:rPr>
-              <w:t>30 min</w:t>
+              <w:t>20 min</w:t>
             </w:r>
           </w:p>
         </w:tc>
@@ -3142,88 +3339,7 @@
               <w:rPr>
                 <w:sz w:val="19"/>
               </w:rPr>
-              <w:t>46–53</w:t>
-            </w:r>
-          </w:p>
-        </w:tc>
-      </w:tr>
-      <w:tr>
-        <w:trPr>
-          <w:cantSplit/>
-        </w:trPr>
-        <w:tc>
-          <w:tcPr>
-            <w:tcW w:type="dxa" w:w="1520"/>
-            <w:shd w:val="clear" w:color="auto" w:fill="E8F7EE"/>
-          </w:tcPr>
-          <w:p>
-            <w:r/>
-            <w:r>
-              <w:rPr>
-                <w:sz w:val="19"/>
-              </w:rPr>
-              <w:t>10:10 – 11:10</w:t>
-            </w:r>
-          </w:p>
-        </w:tc>
-        <w:tc>
-          <w:tcPr>
-            <w:tcW w:type="dxa" w:w="1000"/>
-            <w:shd w:val="clear" w:color="auto" w:fill="E8F7EE"/>
-          </w:tcPr>
-          <w:p>
-            <w:r/>
-            <w:r>
-              <w:rPr>
-                <w:sz w:val="19"/>
-              </w:rPr>
-              <w:t>60 min</w:t>
-            </w:r>
-          </w:p>
-        </w:tc>
-        <w:tc>
-          <w:tcPr>
-            <w:tcW w:type="dxa" w:w="1728"/>
-            <w:shd w:val="clear" w:color="auto" w:fill="E8F7EE"/>
-          </w:tcPr>
-          <w:p>
-            <w:r/>
-            <w:r>
-              <w:rPr>
-                <w:b/>
-                <w:sz w:val="19"/>
-              </w:rPr>
-              <w:t>Lab 6 — HTTP and Application Approval Agent — web form to agent flow, six ordered rules, four decisions</w:t>
-            </w:r>
-          </w:p>
-        </w:tc>
-        <w:tc>
-          <w:tcPr>
-            <w:tcW w:type="dxa" w:w="1760"/>
-            <w:shd w:val="clear" w:color="auto" w:fill="E8F7EE"/>
-          </w:tcPr>
-          <w:p>
-            <w:r/>
-            <w:r>
-              <w:rPr>
-                <w:sz w:val="19"/>
-              </w:rPr>
-              <w:t>Hands-on lab</w:t>
-            </w:r>
-          </w:p>
-        </w:tc>
-        <w:tc>
-          <w:tcPr>
-            <w:tcW w:type="dxa" w:w="1120"/>
-            <w:shd w:val="clear" w:color="auto" w:fill="E8F7EE"/>
-          </w:tcPr>
-          <w:p>
-            <w:r/>
-            <w:r>
-              <w:rPr>
-                <w:sz w:val="19"/>
-              </w:rPr>
-              <w:t>54</w:t>
+              <w:t>51–58</w:t>
             </w:r>
           </w:p>
         </w:tc>
@@ -3243,7 +3359,7 @@
               <w:rPr>
                 <w:sz w:val="19"/>
               </w:rPr>
-              <w:t>11:10 – 11:25</w:t>
+              <w:t>10:25 – 10:40</w:t>
             </w:r>
           </w:p>
         </w:tc>
@@ -3323,7 +3439,88 @@
               <w:rPr>
                 <w:sz w:val="19"/>
               </w:rPr>
-              <w:t>11:25 – 12:05</w:t>
+              <w:t>10:40 – 11:30</w:t>
+            </w:r>
+          </w:p>
+        </w:tc>
+        <w:tc>
+          <w:tcPr>
+            <w:tcW w:type="dxa" w:w="1000"/>
+            <w:shd w:val="clear" w:color="auto" w:fill="E8F7EE"/>
+          </w:tcPr>
+          <w:p>
+            <w:r/>
+            <w:r>
+              <w:rPr>
+                <w:sz w:val="19"/>
+              </w:rPr>
+              <w:t>50 min</w:t>
+            </w:r>
+          </w:p>
+        </w:tc>
+        <w:tc>
+          <w:tcPr>
+            <w:tcW w:type="dxa" w:w="1728"/>
+            <w:shd w:val="clear" w:color="auto" w:fill="E8F7EE"/>
+          </w:tcPr>
+          <w:p>
+            <w:r/>
+            <w:r>
+              <w:rPr>
+                <w:b/>
+                <w:sz w:val="19"/>
+              </w:rPr>
+              <w:t>Lab 6 — HTTP and Application Approval Agent — web form to agent flow, six ordered rules, four decisions</w:t>
+            </w:r>
+          </w:p>
+        </w:tc>
+        <w:tc>
+          <w:tcPr>
+            <w:tcW w:type="dxa" w:w="1760"/>
+            <w:shd w:val="clear" w:color="auto" w:fill="E8F7EE"/>
+          </w:tcPr>
+          <w:p>
+            <w:r/>
+            <w:r>
+              <w:rPr>
+                <w:sz w:val="19"/>
+              </w:rPr>
+              <w:t>Hands-on lab</w:t>
+            </w:r>
+          </w:p>
+        </w:tc>
+        <w:tc>
+          <w:tcPr>
+            <w:tcW w:type="dxa" w:w="1120"/>
+            <w:shd w:val="clear" w:color="auto" w:fill="E8F7EE"/>
+          </w:tcPr>
+          <w:p>
+            <w:r/>
+            <w:r>
+              <w:rPr>
+                <w:sz w:val="19"/>
+              </w:rPr>
+              <w:t>59</w:t>
+            </w:r>
+          </w:p>
+        </w:tc>
+      </w:tr>
+      <w:tr>
+        <w:trPr>
+          <w:cantSplit/>
+        </w:trPr>
+        <w:tc>
+          <w:tcPr>
+            <w:tcW w:type="dxa" w:w="1520"/>
+            <w:shd w:val="clear" w:color="auto" w:fill="E8F7EE"/>
+          </w:tcPr>
+          <w:p>
+            <w:r/>
+            <w:r>
+              <w:rPr>
+                <w:sz w:val="19"/>
+              </w:rPr>
+              <w:t>11:30 – 12:10</w:t>
             </w:r>
           </w:p>
         </w:tc>
@@ -3384,7 +3581,7 @@
               <w:rPr>
                 <w:sz w:val="19"/>
               </w:rPr>
-              <w:t>55</w:t>
+              <w:t>60</w:t>
             </w:r>
           </w:p>
         </w:tc>
@@ -3404,7 +3601,7 @@
               <w:rPr>
                 <w:sz w:val="19"/>
               </w:rPr>
-              <w:t>12:05 – 1:05</w:t>
+              <w:t>12:10 – 1:10</w:t>
             </w:r>
           </w:p>
         </w:tc>
@@ -3484,7 +3681,7 @@
               <w:rPr>
                 <w:sz w:val="19"/>
               </w:rPr>
-              <w:t>1:05 – 2:05</w:t>
+              <w:t>1:10 – 2:10</w:t>
             </w:r>
           </w:p>
         </w:tc>
@@ -3545,7 +3742,7 @@
               <w:rPr>
                 <w:sz w:val="19"/>
               </w:rPr>
-              <w:t>56</w:t>
+              <w:t>61</w:t>
             </w:r>
           </w:p>
         </w:tc>
@@ -3565,7 +3762,7 @@
               <w:rPr>
                 <w:sz w:val="19"/>
               </w:rPr>
-              <w:t>2:05 – 2:20</w:t>
+              <w:t>2:10 – 2:20</w:t>
             </w:r>
           </w:p>
         </w:tc>
@@ -3580,7 +3777,7 @@
               <w:rPr>
                 <w:sz w:val="19"/>
               </w:rPr>
-              <w:t>15 min</w:t>
+              <w:t>10 min</w:t>
             </w:r>
           </w:p>
         </w:tc>
@@ -3626,7 +3823,7 @@
               <w:rPr>
                 <w:sz w:val="19"/>
               </w:rPr>
-              <w:t>57–61</w:t>
+              <w:t>62–66</w:t>
             </w:r>
           </w:p>
         </w:tc>
@@ -3707,7 +3904,7 @@
               <w:rPr>
                 <w:sz w:val="19"/>
               </w:rPr>
-              <w:t>62</w:t>
+              <w:t>67</w:t>
             </w:r>
           </w:p>
         </w:tc>
@@ -3868,7 +4065,7 @@
               <w:rPr>
                 <w:sz w:val="19"/>
               </w:rPr>
-              <w:t>63</w:t>
+              <w:t>68</w:t>
             </w:r>
           </w:p>
         </w:tc>
@@ -3949,7 +4146,7 @@
               <w:rPr>
                 <w:sz w:val="19"/>
               </w:rPr>
-              <w:t>64–67</w:t>
+              <w:t>69–72</w:t>
             </w:r>
           </w:p>
         </w:tc>
@@ -4030,7 +4227,7 @@
               <w:rPr>
                 <w:sz w:val="19"/>
               </w:rPr>
-              <w:t>68–75</w:t>
+              <w:t>73–80</w:t>
             </w:r>
           </w:p>
         </w:tc>
@@ -4111,7 +4308,7 @@
               <w:rPr>
                 <w:sz w:val="19"/>
               </w:rPr>
-              <w:t>68–75</w:t>
+              <w:t>73–80</w:t>
             </w:r>
           </w:p>
         </w:tc>
@@ -4144,7 +4341,7 @@
         <w:pStyle w:val="Heading3"/>
       </w:pPr>
       <w:r>
-        <w:t>Lab 0 — Environment Setup · Slides 22</w:t>
+        <w:t>Lab 0 — Environment Setup · Slides 23</w:t>
       </w:r>
     </w:p>
     <w:p>
@@ -4157,7 +4354,7 @@
         <w:pStyle w:val="Heading3"/>
       </w:pPr>
       <w:r>
-        <w:t>Lab 1 — Trigger and Actions · Slides 23</w:t>
+        <w:t>Lab 1 — Trigger and Actions · Slides 24</w:t>
       </w:r>
     </w:p>
     <w:p>
@@ -4170,7 +4367,7 @@
         <w:pStyle w:val="Heading3"/>
       </w:pPr>
       <w:r>
-        <w:t>Lab 2 — Log to Excel · Slides 24</w:t>
+        <w:t>Lab 2 — Log to Excel · Slides 25</w:t>
       </w:r>
     </w:p>
     <w:p>
@@ -4183,7 +4380,7 @@
         <w:pStyle w:val="Heading3"/>
       </w:pPr>
       <w:r>
-        <w:t>Lab 3 — Leave Application Approval · Slides 29</w:t>
+        <w:t>Lab 3 — Leave Application Approval · Slides 30</w:t>
       </w:r>
     </w:p>
     <w:p>
@@ -4196,12 +4393,25 @@
         <w:pStyle w:val="Heading3"/>
       </w:pPr>
       <w:r>
-        <w:t>Lab 4 — Agents · Slides 44</w:t>
+        <w:t>Lab 4 — Agents · Slides 47</w:t>
       </w:r>
     </w:p>
     <w:p>
       <w:r>
         <w:t>Duration: 45 minutes. Follow the matching detailed, step-by-step lab and its shared workflow visual in the Learner Guide.</w:t>
+      </w:r>
+    </w:p>
+    <w:p>
+      <w:pPr>
+        <w:pStyle w:val="Heading3"/>
+      </w:pPr>
+      <w:r>
+        <w:t>Lab 4b — Multi-Agent Content Team · Slides 48</w:t>
+      </w:r>
+    </w:p>
+    <w:p>
+      <w:r>
+        <w:t>Duration: 60–75 minutes (optional — self-paced extension). Follow the matching detailed, step-by-step lab and its shared workflow visual in the Learner Guide.</w:t>
       </w:r>
     </w:p>
     <w:p>
@@ -4217,7 +4427,7 @@
         <w:pStyle w:val="Heading3"/>
       </w:pPr>
       <w:r>
-        <w:t>Lab 5 — Invoke Agents · Slides 45</w:t>
+        <w:t>Lab 5 — Calling Agent from Workflow · Slides 49</w:t>
       </w:r>
     </w:p>
     <w:p>
@@ -4230,7 +4440,46 @@
         <w:pStyle w:val="Heading3"/>
       </w:pPr>
       <w:r>
-        <w:t>Lab 6 — HTTP and Application Approval Agent · Slides 54</w:t>
+        <w:t>Lab 5b — Calling Workflow from Agent · Slides 50</w:t>
+      </w:r>
+    </w:p>
+    <w:p>
+      <w:r>
+        <w:t>Duration: 30 minutes. Follow the matching detailed, step-by-step lab and its shared workflow visual in the Learner Guide.</w:t>
+      </w:r>
+    </w:p>
+    <w:p>
+      <w:pPr>
+        <w:pStyle w:val="Heading3"/>
+      </w:pPr>
+      <w:r>
+        <w:t>Lab 6 — HTTP and Application Approval Agent · Slides 59</w:t>
+      </w:r>
+    </w:p>
+    <w:p>
+      <w:r>
+        <w:t>Duration: 50 minutes. Follow the matching detailed, step-by-step lab and its shared workflow visual in the Learner Guide.</w:t>
+      </w:r>
+    </w:p>
+    <w:p>
+      <w:pPr>
+        <w:pStyle w:val="Heading3"/>
+      </w:pPr>
+      <w:r>
+        <w:t>Lab 7 — HTTP and Chatbot · Slides 60</w:t>
+      </w:r>
+    </w:p>
+    <w:p>
+      <w:r>
+        <w:t>Duration: 40 minutes. Follow the matching detailed, step-by-step lab and its shared workflow visual in the Learner Guide.</w:t>
+      </w:r>
+    </w:p>
+    <w:p>
+      <w:pPr>
+        <w:pStyle w:val="Heading3"/>
+      </w:pPr>
+      <w:r>
+        <w:t>Lab 8 — HTTP and Human Review · Slides 61</w:t>
       </w:r>
     </w:p>
     <w:p>
@@ -4243,7 +4492,7 @@
         <w:pStyle w:val="Heading3"/>
       </w:pPr>
       <w:r>
-        <w:t>Lab 7 — HTTP and Chatbot · Slides 55</w:t>
+        <w:t>Lab 9 — RAG with Knowledge Base · Slides 67</w:t>
       </w:r>
     </w:p>
     <w:p>
@@ -4256,33 +4505,7 @@
         <w:pStyle w:val="Heading3"/>
       </w:pPr>
       <w:r>
-        <w:t>Lab 8 — HTTP and Human Review · Slides 56</w:t>
-      </w:r>
-    </w:p>
-    <w:p>
-      <w:r>
-        <w:t>Duration: 60 minutes. Follow the matching detailed, step-by-step lab and its shared workflow visual in the Learner Guide.</w:t>
-      </w:r>
-    </w:p>
-    <w:p>
-      <w:pPr>
-        <w:pStyle w:val="Heading3"/>
-      </w:pPr>
-      <w:r>
-        <w:t>Lab 9 — RAG with Knowledge Base · Slides 62</w:t>
-      </w:r>
-    </w:p>
-    <w:p>
-      <w:r>
-        <w:t>Duration: 40 minutes. Follow the matching detailed, step-by-step lab and its shared workflow visual in the Learner Guide.</w:t>
-      </w:r>
-    </w:p>
-    <w:p>
-      <w:pPr>
-        <w:pStyle w:val="Heading3"/>
-      </w:pPr>
-      <w:r>
-        <w:t>Lab 10 — RAG with Pinecone · Slides 63</w:t>
+        <w:t>Lab 10 — RAG with Pinecone · Slides 68</w:t>
       </w:r>
     </w:p>
     <w:p>

</xml_diff>

<commit_message>
feat: v7.4 — Lab 8 slide shows the live simplified classroom flow
The Lab 8 workflow slide (61) now carries the canvas screenshot of the
repaired designer build (Excel logging removed); its banner and the manifest
drop Excel Online accordingly. Cover bumped to Version 7.4 (7 Aug 2026), LP
rebuilt with a 7.4 record row, v7.3 deck archived; slide count and all
mappings unchanged.

Co-Authored-By: Claude Fable 5 <noreply@anthropic.com>
</commit_message>
<xml_diff>
--- a/courseware/LP-Business Process Automation with Power Automate and Copilot Studio Agents.docx
+++ b/courseware/LP-Business Process Automation with Power Automate and Copilot Studio Agents.docx
@@ -206,7 +206,7 @@
           <w:color w:val="1F6FEB"/>
           <w:sz w:val="24"/>
         </w:rPr>
-        <w:t>Version 7.3</w:t>
+        <w:t>Version 7.4</w:t>
       </w:r>
     </w:p>
     <w:p>
@@ -1180,6 +1180,64 @@
           </w:p>
         </w:tc>
       </w:tr>
+      <w:tr>
+        <w:tc>
+          <w:tcPr>
+            <w:tcW w:type="dxa" w:w="2160"/>
+          </w:tcPr>
+          <w:p>
+            <w:r/>
+            <w:r>
+              <w:rPr>
+                <w:sz w:val="19"/>
+              </w:rPr>
+              <w:t>7.4</w:t>
+            </w:r>
+          </w:p>
+        </w:tc>
+        <w:tc>
+          <w:tcPr>
+            <w:tcW w:type="dxa" w:w="2160"/>
+          </w:tcPr>
+          <w:p>
+            <w:r/>
+            <w:r>
+              <w:rPr>
+                <w:sz w:val="19"/>
+              </w:rPr>
+              <w:t>7 Aug 2026</w:t>
+            </w:r>
+          </w:p>
+        </w:tc>
+        <w:tc>
+          <w:tcPr>
+            <w:tcW w:type="dxa" w:w="2160"/>
+          </w:tcPr>
+          <w:p>
+            <w:r/>
+            <w:r>
+              <w:rPr>
+                <w:sz w:val="19"/>
+              </w:rPr>
+              <w:t>Deck v7.4 — the Lab 8 workflow slide now shows the live simplified classroom flow (Excel logging removed) captured from the repaired designer build; slide count and mappings unchanged.</w:t>
+            </w:r>
+          </w:p>
+        </w:tc>
+        <w:tc>
+          <w:tcPr>
+            <w:tcW w:type="dxa" w:w="2160"/>
+          </w:tcPr>
+          <w:p>
+            <w:r/>
+            <w:r>
+              <w:rPr>
+                <w:sz w:val="19"/>
+              </w:rPr>
+              <w:t>Course Development Team</w:t>
+            </w:r>
+          </w:p>
+        </w:tc>
+      </w:tr>
     </w:tbl>
     <w:p>
       <w:r>
@@ -1634,7 +1692,7 @@
     </w:p>
     <w:p>
       <w:r>
-        <w:t>The Slides column maps each session to the matching slides in the facilitator deck (Business Process Automation with Power Automate and Copilot Studio Agents-v7.3.pptx, 80 slides) so trainers can pace delivery against the deck.</w:t>
+        <w:t>The Slides column maps each session to the matching slides in the facilitator deck (Business Process Automation with Power Automate and Copilot Studio Agents-v7.4.pptx, 80 slides) so trainers can pace delivery against the deck.</w:t>
       </w:r>
     </w:p>
     <w:p>

</xml_diff>